<commit_message>
modified:   Documentatie website informatica.docx 	modified:   Stijl.css
</commit_message>
<xml_diff>
--- a/Documentatie website informatica.docx
+++ b/Documentatie website informatica.docx
@@ -601,7 +601,10 @@
         <w:t xml:space="preserve">bijvoorbeeld of ik een afbeelding een absolute of relatieve positie moest geven. De moeilijkheid lag vooral bij het feit dat de webpagina moet werken bij verschillende schermgroottes. </w:t>
       </w:r>
       <w:r>
-        <w:t>Maar volgens mij is dat uiteindelijk met verschillende ‘</w:t>
+        <w:t>Maar volgens mij is dat uiteindelijk met</w:t>
+      </w:r>
+      <w:r>
+        <w:t xml:space="preserve"> veel gebruik van ‘</w:t>
       </w:r>
       <w:proofErr w:type="spellStart"/>
       <w:r>
@@ -609,7 +612,18 @@
       </w:r>
       <w:proofErr w:type="spellEnd"/>
       <w:r>
-        <w:t xml:space="preserve">’ onderdelen gelukt. </w:t>
+        <w:t>’ en ‘</w:t>
+      </w:r>
+      <w:proofErr w:type="spellStart"/>
+      <w:r>
+        <w:t>clamp</w:t>
+      </w:r>
+      <w:proofErr w:type="spellEnd"/>
+      <w:r>
+        <w:t>’ gelukt</w:t>
+      </w:r>
+      <w:r>
+        <w:t xml:space="preserve"> </w:t>
       </w:r>
     </w:p>
     <w:p>

</xml_diff>

<commit_message>
modified:   Documentatie website informatica.docx 	modified:   artikel.html
</commit_message>
<xml_diff>
--- a/Documentatie website informatica.docx
+++ b/Documentatie website informatica.docx
@@ -604,7 +604,7 @@
         <w:t>Maar volgens mij is dat uiteindelijk met</w:t>
       </w:r>
       <w:r>
-        <w:t xml:space="preserve"> veel gebruik van ‘</w:t>
+        <w:t xml:space="preserve"> gebruik van ‘</w:t>
       </w:r>
       <w:proofErr w:type="spellStart"/>
       <w:r>
@@ -623,7 +623,7 @@
         <w:t>’ gelukt</w:t>
       </w:r>
       <w:r>
-        <w:t xml:space="preserve"> </w:t>
+        <w:t xml:space="preserve">. </w:t>
       </w:r>
     </w:p>
     <w:p>

</xml_diff>